<commit_message>
Checkpoints Revenue Report work
</commit_message>
<xml_diff>
--- a/CUWebinars.Web/App_Data/mergeTemplates/WeeklyInvoice.docx
+++ b/CUWebinars.Web/App_Data/mergeTemplates/WeeklyInvoice.docx
@@ -3422,20 +3422,21 @@
     <w:tbl>
       <w:tblPr>
         <w:tblStyle w:val="TableGrid"/>
-        <w:tblW w:w="4877" w:type="pct"/>
+        <w:tblW w:w="5000" w:type="pct"/>
         <w:tblLayout w:type="fixed"/>
         <w:tblLook w:val="04A0" w:firstRow="1" w:lastRow="0" w:firstColumn="1" w:lastColumn="0" w:noHBand="0" w:noVBand="1"/>
       </w:tblPr>
       <w:tblGrid>
-        <w:gridCol w:w="716"/>
-        <w:gridCol w:w="4858"/>
-        <w:gridCol w:w="1082"/>
-        <w:gridCol w:w="3869"/>
+        <w:gridCol w:w="664"/>
+        <w:gridCol w:w="4517"/>
+        <w:gridCol w:w="1114"/>
+        <w:gridCol w:w="1170"/>
+        <w:gridCol w:w="3325"/>
       </w:tblGrid>
       <w:tr>
         <w:tc>
           <w:tcPr>
-            <w:tcW w:w="340" w:type="pct"/>
+            <w:tcW w:w="308" w:type="pct"/>
             <w:shd w:val="clear" w:color="auto" w:fill="323E4F" w:themeFill="text2" w:themeFillShade="BF"/>
             <w:vAlign w:val="center"/>
           </w:tcPr>
@@ -3456,7 +3457,7 @@
         </w:tc>
         <w:tc>
           <w:tcPr>
-            <w:tcW w:w="2308" w:type="pct"/>
+            <w:tcW w:w="2093" w:type="pct"/>
             <w:shd w:val="clear" w:color="auto" w:fill="323E4F" w:themeFill="text2" w:themeFillShade="BF"/>
             <w:vAlign w:val="center"/>
           </w:tcPr>
@@ -3486,7 +3487,36 @@
         </w:tc>
         <w:tc>
           <w:tcPr>
-            <w:tcW w:w="514" w:type="pct"/>
+            <w:tcW w:w="516" w:type="pct"/>
+            <w:shd w:val="clear" w:color="auto" w:fill="323E4F" w:themeFill="text2" w:themeFillShade="BF"/>
+          </w:tcPr>
+          <w:p>
+            <w:pPr>
+              <w:spacing w:before="0" w:after="200" w:line="276" w:lineRule="auto"/>
+              <w:ind w:left="0" w:right="0"/>
+              <w:contextualSpacing/>
+              <w:jc w:val="center"/>
+              <w:rPr>
+                <w:rFonts w:eastAsia="Times New Roman" w:cs="Times New Roman"/>
+                <w:color w:val="auto"/>
+                <w:sz w:val="22"/>
+                <w:szCs w:val="22"/>
+              </w:rPr>
+            </w:pPr>
+            <w:r>
+              <w:rPr>
+                <w:rFonts w:eastAsia="Times New Roman" w:cs="Times New Roman"/>
+                <w:color w:val="auto"/>
+                <w:sz w:val="22"/>
+                <w:szCs w:val="22"/>
+              </w:rPr>
+              <w:t>Adjusted Revenue</w:t>
+            </w:r>
+          </w:p>
+        </w:tc>
+        <w:tc>
+          <w:tcPr>
+            <w:tcW w:w="542" w:type="pct"/>
             <w:shd w:val="clear" w:color="auto" w:fill="323E4F" w:themeFill="text2" w:themeFillShade="BF"/>
             <w:vAlign w:val="center"/>
           </w:tcPr>
@@ -3503,8 +3533,6 @@
                 <w:szCs w:val="22"/>
               </w:rPr>
             </w:pPr>
-            <w:bookmarkStart w:id="3" w:name="_GoBack"/>
-            <w:bookmarkEnd w:id="3"/>
             <w:r>
               <w:rPr>
                 <w:rFonts w:eastAsia="Times New Roman" w:cs="Times New Roman"/>
@@ -3518,7 +3546,7 @@
         </w:tc>
         <w:tc>
           <w:tcPr>
-            <w:tcW w:w="1838" w:type="pct"/>
+            <w:tcW w:w="1541" w:type="pct"/>
             <w:shd w:val="clear" w:color="auto" w:fill="323E4F" w:themeFill="text2" w:themeFillShade="BF"/>
             <w:vAlign w:val="center"/>
           </w:tcPr>
@@ -3547,23 +3575,37 @@
           </w:p>
         </w:tc>
       </w:tr>
+      <w:bookmarkStart w:id="3" w:name="_GoBack" w:colFirst="4" w:colLast="4"/>
       <w:tr>
         <w:tc>
           <w:tcPr>
-            <w:tcW w:w="340" w:type="pct"/>
+            <w:tcW w:w="308" w:type="pct"/>
           </w:tcPr>
           <w:p>
             <w:pPr>
               <w:jc w:val="right"/>
             </w:pPr>
-            <w:fldSimple w:instr=" MERGEFIELD  RangeStart:uOrders  \* MERGEFORMAT ">
-              <w:r>
-                <w:rPr>
-                  <w:noProof/>
-                </w:rPr>
-                <w:t>«RangeStart:uOrders»</w:t>
-              </w:r>
-            </w:fldSimple>
+            <w:r>
+              <w:fldChar w:fldCharType="begin"/>
+            </w:r>
+            <w:r>
+              <w:instrText xml:space="preserve"> MERGEFIELD  RangeStart:uOrders  \* MERGEFORMAT </w:instrText>
+            </w:r>
+            <w:r>
+              <w:fldChar w:fldCharType="separate"/>
+            </w:r>
+            <w:r>
+              <w:rPr>
+                <w:noProof/>
+              </w:rPr>
+              <w:t>«RangeStart:uOrders»</w:t>
+            </w:r>
+            <w:r>
+              <w:rPr>
+                <w:noProof/>
+              </w:rPr>
+              <w:fldChar w:fldCharType="end"/>
+            </w:r>
             <w:fldSimple w:instr=" MERGEFIELD  RowNumber \f .  \* MERGEFORMAT ">
               <w:r>
                 <w:rPr>
@@ -3576,7 +3618,7 @@
         </w:tc>
         <w:tc>
           <w:tcPr>
-            <w:tcW w:w="2308" w:type="pct"/>
+            <w:tcW w:w="2093" w:type="pct"/>
           </w:tcPr>
           <w:p>
             <w:pPr>
@@ -3846,69 +3888,7 @@
         </w:tc>
         <w:tc>
           <w:tcPr>
-            <w:tcW w:w="514" w:type="pct"/>
-            <w:vAlign w:val="center"/>
-          </w:tcPr>
-          <w:p>
-            <w:pPr>
-              <w:spacing w:before="0" w:after="200" w:line="276" w:lineRule="auto"/>
-              <w:ind w:left="0" w:right="0"/>
-              <w:contextualSpacing/>
-              <w:jc w:val="right"/>
-              <w:rPr>
-                <w:rFonts w:eastAsia="Times New Roman" w:cs="Times New Roman"/>
-                <w:color w:val="auto"/>
-                <w:sz w:val="22"/>
-                <w:szCs w:val="22"/>
-              </w:rPr>
-            </w:pPr>
-            <w:r>
-              <w:rPr>
-                <w:rFonts w:eastAsia="Times New Roman" w:cs="Times New Roman"/>
-                <w:color w:val="auto"/>
-                <w:szCs w:val="22"/>
-              </w:rPr>
-              <w:fldChar w:fldCharType="begin"/>
-            </w:r>
-            <w:r>
-              <w:rPr>
-                <w:rFonts w:eastAsia="Times New Roman" w:cs="Times New Roman"/>
-                <w:color w:val="auto"/>
-                <w:szCs w:val="22"/>
-              </w:rPr>
-              <w:instrText xml:space="preserve"> MERGEFIELD  AdjustedRoyalty  \* MERGEFORMAT </w:instrText>
-            </w:r>
-            <w:r>
-              <w:rPr>
-                <w:rFonts w:eastAsia="Times New Roman" w:cs="Times New Roman"/>
-                <w:color w:val="auto"/>
-                <w:szCs w:val="22"/>
-              </w:rPr>
-              <w:fldChar w:fldCharType="separate"/>
-            </w:r>
-            <w:r>
-              <w:rPr>
-                <w:rFonts w:eastAsia="Times New Roman" w:cs="Times New Roman"/>
-                <w:noProof/>
-                <w:color w:val="auto"/>
-                <w:szCs w:val="22"/>
-              </w:rPr>
-              <w:t>«AdjustedRoyalty»</w:t>
-            </w:r>
-            <w:r>
-              <w:rPr>
-                <w:rFonts w:eastAsia="Times New Roman" w:cs="Times New Roman"/>
-                <w:color w:val="auto"/>
-                <w:szCs w:val="22"/>
-              </w:rPr>
-              <w:fldChar w:fldCharType="end"/>
-            </w:r>
-          </w:p>
-        </w:tc>
-        <w:tc>
-          <w:tcPr>
-            <w:tcW w:w="1838" w:type="pct"/>
-            <w:vAlign w:val="center"/>
+            <w:tcW w:w="516" w:type="pct"/>
           </w:tcPr>
           <w:p>
             <w:pPr>
@@ -3919,7 +3899,6 @@
               <w:rPr>
                 <w:rFonts w:eastAsia="Times New Roman" w:cs="Times New Roman"/>
                 <w:color w:val="auto"/>
-                <w:sz w:val="22"/>
                 <w:szCs w:val="22"/>
               </w:rPr>
             </w:pPr>
@@ -3927,7 +3906,6 @@
               <w:rPr>
                 <w:rFonts w:eastAsia="Times New Roman" w:cs="Times New Roman"/>
                 <w:color w:val="auto"/>
-                <w:sz w:val="18"/>
                 <w:szCs w:val="22"/>
               </w:rPr>
               <w:fldChar w:fldCharType="begin"/>
@@ -3936,97 +3914,146 @@
               <w:rPr>
                 <w:rFonts w:eastAsia="Times New Roman" w:cs="Times New Roman"/>
                 <w:color w:val="auto"/>
-                <w:sz w:val="18"/>
-                <w:szCs w:val="22"/>
+                <w:szCs w:val="22"/>
+              </w:rPr>
+              <w:instrText xml:space="preserve"> MERGEFIELD  AdjustedPrice  \* MERGEFORMAT </w:instrText>
+            </w:r>
+            <w:r>
+              <w:rPr>
+                <w:rFonts w:eastAsia="Times New Roman" w:cs="Times New Roman"/>
+                <w:color w:val="auto"/>
+                <w:szCs w:val="22"/>
+              </w:rPr>
+              <w:fldChar w:fldCharType="separate"/>
+            </w:r>
+            <w:r>
+              <w:rPr>
+                <w:rFonts w:eastAsia="Times New Roman" w:cs="Times New Roman"/>
+                <w:noProof/>
+                <w:color w:val="auto"/>
+                <w:szCs w:val="22"/>
+              </w:rPr>
+              <w:t>«AdjustedPrice»</w:t>
+            </w:r>
+            <w:r>
+              <w:rPr>
+                <w:rFonts w:eastAsia="Times New Roman" w:cs="Times New Roman"/>
+                <w:color w:val="auto"/>
+                <w:szCs w:val="22"/>
+              </w:rPr>
+              <w:fldChar w:fldCharType="end"/>
+            </w:r>
+          </w:p>
+        </w:tc>
+        <w:tc>
+          <w:tcPr>
+            <w:tcW w:w="542" w:type="pct"/>
+          </w:tcPr>
+          <w:p>
+            <w:pPr>
+              <w:jc w:val="center"/>
+              <w:rPr>
+                <w:sz w:val="22"/>
+              </w:rPr>
+            </w:pPr>
+            <w:r>
+              <w:fldChar w:fldCharType="begin"/>
+            </w:r>
+            <w:r>
+              <w:instrText xml:space="preserve"> MERGEFIELD  AdjustedRoyalty  \* MERGEFORMAT </w:instrText>
+            </w:r>
+            <w:r>
+              <w:fldChar w:fldCharType="separate"/>
+            </w:r>
+            <w:r>
+              <w:rPr>
+                <w:noProof/>
+              </w:rPr>
+              <w:t>«</w:t>
+            </w:r>
+            <w:proofErr w:type="spellStart"/>
+            <w:r>
+              <w:t>AdjustedRoyalty</w:t>
+            </w:r>
+            <w:proofErr w:type="spellEnd"/>
+            <w:r>
+              <w:rPr>
+                <w:noProof/>
+              </w:rPr>
+              <w:t>»</w:t>
+            </w:r>
+            <w:r>
+              <w:fldChar w:fldCharType="end"/>
+            </w:r>
+          </w:p>
+        </w:tc>
+        <w:tc>
+          <w:tcPr>
+            <w:tcW w:w="1541" w:type="pct"/>
+          </w:tcPr>
+          <w:p>
+            <w:pPr>
+              <w:jc w:val="center"/>
+            </w:pPr>
+            <w:r>
+              <w:rPr>
+                <w:sz w:val="18"/>
+              </w:rPr>
+              <w:fldChar w:fldCharType="begin"/>
+            </w:r>
+            <w:r>
+              <w:rPr>
+                <w:sz w:val="18"/>
               </w:rPr>
               <w:instrText xml:space="preserve"> MERGEFIELD  Message  \* MERGEFORMAT </w:instrText>
             </w:r>
             <w:r>
               <w:rPr>
-                <w:rFonts w:eastAsia="Times New Roman" w:cs="Times New Roman"/>
-                <w:color w:val="auto"/>
-                <w:sz w:val="18"/>
-                <w:szCs w:val="22"/>
+                <w:sz w:val="18"/>
               </w:rPr>
               <w:fldChar w:fldCharType="separate"/>
             </w:r>
             <w:r>
               <w:rPr>
-                <w:rFonts w:eastAsia="Times New Roman" w:cs="Times New Roman"/>
                 <w:noProof/>
-                <w:color w:val="auto"/>
-                <w:sz w:val="18"/>
-                <w:szCs w:val="22"/>
-              </w:rPr>
-              <w:t>«Message»</w:t>
-            </w:r>
-            <w:r>
-              <w:rPr>
-                <w:rFonts w:eastAsia="Times New Roman" w:cs="Times New Roman"/>
-                <w:color w:val="auto"/>
-                <w:sz w:val="18"/>
-                <w:szCs w:val="22"/>
+                <w:sz w:val="18"/>
+              </w:rPr>
+              <w:t>«</w:t>
+            </w:r>
+            <w:r>
+              <w:t>Message</w:t>
+            </w:r>
+            <w:r>
+              <w:rPr>
+                <w:noProof/>
+                <w:sz w:val="18"/>
+              </w:rPr>
+              <w:t>»</w:t>
+            </w:r>
+            <w:r>
+              <w:rPr>
+                <w:sz w:val="18"/>
               </w:rPr>
               <w:fldChar w:fldCharType="end"/>
             </w:r>
             <w:r>
               <w:rPr>
-                <w:rFonts w:eastAsia="Times New Roman" w:cs="Times New Roman"/>
-                <w:color w:val="auto"/>
-                <w:sz w:val="18"/>
-                <w:szCs w:val="22"/>
+                <w:sz w:val="18"/>
               </w:rPr>
               <w:t xml:space="preserve"> </w:t>
             </w:r>
-            <w:r>
-              <w:rPr>
-                <w:rFonts w:eastAsia="Times New Roman" w:cs="Times New Roman"/>
-                <w:color w:val="auto"/>
-                <w:sz w:val="22"/>
-                <w:szCs w:val="22"/>
-              </w:rPr>
-              <w:fldChar w:fldCharType="begin"/>
-            </w:r>
-            <w:r>
-              <w:rPr>
-                <w:rFonts w:eastAsia="Times New Roman" w:cs="Times New Roman"/>
-                <w:color w:val="auto"/>
-                <w:sz w:val="22"/>
-                <w:szCs w:val="22"/>
-              </w:rPr>
-              <w:instrText xml:space="preserve"> MERGEFIELD  RangeEnd:uOrders  \* MERGEFORMAT </w:instrText>
-            </w:r>
-            <w:r>
-              <w:rPr>
-                <w:rFonts w:eastAsia="Times New Roman" w:cs="Times New Roman"/>
-                <w:color w:val="auto"/>
-                <w:sz w:val="22"/>
-                <w:szCs w:val="22"/>
-              </w:rPr>
-              <w:fldChar w:fldCharType="separate"/>
-            </w:r>
-            <w:r>
-              <w:rPr>
-                <w:rFonts w:eastAsia="Times New Roman" w:cs="Times New Roman"/>
-                <w:noProof/>
-                <w:color w:val="auto"/>
-                <w:sz w:val="22"/>
-                <w:szCs w:val="22"/>
-              </w:rPr>
-              <w:t>«RangeEnd:uOrders»</w:t>
-            </w:r>
-            <w:r>
-              <w:rPr>
-                <w:rFonts w:eastAsia="Times New Roman" w:cs="Times New Roman"/>
-                <w:color w:val="auto"/>
-                <w:sz w:val="22"/>
-                <w:szCs w:val="22"/>
-              </w:rPr>
-              <w:fldChar w:fldCharType="end"/>
-            </w:r>
+            <w:fldSimple w:instr=" MERGEFIELD  RangeEnd:uOrders  \* MERGEFORMAT ">
+              <w:r>
+                <w:rPr>
+                  <w:noProof/>
+                </w:rPr>
+                <w:t>«RangeEnd:uOrders»</w:t>
+              </w:r>
+            </w:fldSimple>
           </w:p>
         </w:tc>
       </w:tr>
+      <w:bookmarkEnd w:id="3"/>
     </w:tbl>
     <w:p>
       <w:pPr>

</xml_diff>

<commit_message>
Optimization attempts to Invoice Generator to accomodate SQL Azure slowness.
</commit_message>
<xml_diff>
--- a/CUWebinars.Web/App_Data/mergeTemplates/WeeklyInvoice.docx
+++ b/CUWebinars.Web/App_Data/mergeTemplates/WeeklyInvoice.docx
@@ -381,6 +381,7 @@
     </w:p>
     <w:p>
       <w:pPr>
+        <w:keepNext/>
         <w:spacing w:before="0" w:after="200" w:line="276" w:lineRule="auto"/>
         <w:ind w:left="0" w:right="0"/>
         <w:contextualSpacing/>
@@ -556,10 +557,10 @@
       </w:tblPr>
       <w:tblGrid>
         <w:gridCol w:w="682"/>
-        <w:gridCol w:w="5704"/>
-        <w:gridCol w:w="898"/>
+        <w:gridCol w:w="5613"/>
+        <w:gridCol w:w="1079"/>
         <w:gridCol w:w="991"/>
-        <w:gridCol w:w="1079"/>
+        <w:gridCol w:w="989"/>
         <w:gridCol w:w="1440"/>
       </w:tblGrid>
       <w:tr>
@@ -589,7 +590,7 @@
         </w:tc>
         <w:tc>
           <w:tcPr>
-            <w:tcW w:w="2642" w:type="pct"/>
+            <w:tcW w:w="2600" w:type="pct"/>
             <w:shd w:val="clear" w:color="auto" w:fill="323E4F" w:themeFill="text2" w:themeFillShade="BF"/>
             <w:vAlign w:val="center"/>
           </w:tcPr>
@@ -619,7 +620,7 @@
         </w:tc>
         <w:tc>
           <w:tcPr>
-            <w:tcW w:w="416" w:type="pct"/>
+            <w:tcW w:w="500" w:type="pct"/>
             <w:shd w:val="clear" w:color="auto" w:fill="323E4F" w:themeFill="text2" w:themeFillShade="BF"/>
             <w:vAlign w:val="center"/>
           </w:tcPr>
@@ -673,36 +674,13 @@
                 <w:sz w:val="22"/>
                 <w:szCs w:val="22"/>
               </w:rPr>
-              <w:t>Percent</w:t>
-            </w:r>
-          </w:p>
-          <w:p>
-            <w:pPr>
-              <w:spacing w:before="0" w:after="200" w:line="276" w:lineRule="auto"/>
-              <w:ind w:left="0" w:right="0"/>
-              <w:contextualSpacing/>
-              <w:jc w:val="center"/>
-              <w:rPr>
-                <w:rFonts w:eastAsia="Times New Roman" w:cs="Times New Roman"/>
-                <w:color w:val="auto"/>
-                <w:sz w:val="22"/>
-                <w:szCs w:val="22"/>
-              </w:rPr>
-            </w:pPr>
-            <w:r>
-              <w:rPr>
-                <w:rFonts w:eastAsia="Times New Roman" w:cs="Times New Roman"/>
-                <w:color w:val="auto"/>
-                <w:sz w:val="22"/>
-                <w:szCs w:val="22"/>
-              </w:rPr>
-              <w:t>Paid</w:t>
+              <w:t>% Paid</w:t>
             </w:r>
           </w:p>
         </w:tc>
         <w:tc>
           <w:tcPr>
-            <w:tcW w:w="500" w:type="pct"/>
+            <w:tcW w:w="458" w:type="pct"/>
             <w:shd w:val="clear" w:color="auto" w:fill="323E4F" w:themeFill="text2" w:themeFillShade="BF"/>
             <w:vAlign w:val="center"/>
           </w:tcPr>
@@ -851,10 +829,11 @@
         </w:tc>
         <w:tc>
           <w:tcPr>
-            <w:tcW w:w="2642" w:type="pct"/>
+            <w:tcW w:w="2600" w:type="pct"/>
           </w:tcPr>
           <w:p>
             <w:pPr>
+              <w:keepLines/>
               <w:spacing w:before="0" w:after="200" w:line="276" w:lineRule="auto"/>
               <w:ind w:left="0" w:right="0"/>
               <w:contextualSpacing/>
@@ -969,6 +948,7 @@
           </w:p>
           <w:p>
             <w:pPr>
+              <w:keepLines/>
               <w:spacing w:before="0" w:after="200" w:line="276" w:lineRule="auto"/>
               <w:ind w:left="0" w:right="0"/>
               <w:contextualSpacing/>
@@ -1029,7 +1009,7 @@
         </w:tc>
         <w:tc>
           <w:tcPr>
-            <w:tcW w:w="416" w:type="pct"/>
+            <w:tcW w:w="500" w:type="pct"/>
             <w:vAlign w:val="center"/>
           </w:tcPr>
           <w:p>
@@ -1221,7 +1201,7 @@
         </w:tc>
         <w:tc>
           <w:tcPr>
-            <w:tcW w:w="500" w:type="pct"/>
+            <w:tcW w:w="458" w:type="pct"/>
             <w:vAlign w:val="center"/>
           </w:tcPr>
           <w:p>
@@ -1414,6 +1394,7 @@
     </w:p>
     <w:p>
       <w:pPr>
+        <w:keepLines/>
         <w:spacing w:before="0" w:after="200" w:line="276" w:lineRule="auto"/>
         <w:ind w:left="0" w:right="0"/>
         <w:contextualSpacing/>
@@ -1849,6 +1830,7 @@
     </w:p>
     <w:p>
       <w:pPr>
+        <w:keepNext/>
         <w:spacing w:before="0" w:after="200" w:line="276" w:lineRule="auto"/>
         <w:ind w:left="0" w:right="0"/>
         <w:contextualSpacing/>
@@ -1947,22 +1929,22 @@
     <w:tbl>
       <w:tblPr>
         <w:tblStyle w:val="TableGrid"/>
-        <w:tblW w:w="5000" w:type="pct"/>
+        <w:tblW w:w="4568" w:type="pct"/>
         <w:tblLayout w:type="fixed"/>
         <w:tblLook w:val="04A0" w:firstRow="1" w:lastRow="0" w:firstColumn="1" w:lastColumn="0" w:noHBand="0" w:noVBand="1"/>
       </w:tblPr>
       <w:tblGrid>
-        <w:gridCol w:w="625"/>
-        <w:gridCol w:w="5790"/>
-        <w:gridCol w:w="1021"/>
-        <w:gridCol w:w="1021"/>
-        <w:gridCol w:w="1021"/>
-        <w:gridCol w:w="1312"/>
+        <w:gridCol w:w="716"/>
+        <w:gridCol w:w="5152"/>
+        <w:gridCol w:w="1151"/>
+        <w:gridCol w:w="990"/>
+        <w:gridCol w:w="897"/>
+        <w:gridCol w:w="952"/>
       </w:tblGrid>
       <w:tr>
         <w:tc>
           <w:tcPr>
-            <w:tcW w:w="290" w:type="pct"/>
+            <w:tcW w:w="363" w:type="pct"/>
             <w:shd w:val="clear" w:color="auto" w:fill="323E4F" w:themeFill="text2" w:themeFillShade="BF"/>
             <w:vAlign w:val="center"/>
           </w:tcPr>
@@ -1983,7 +1965,7 @@
         </w:tc>
         <w:tc>
           <w:tcPr>
-            <w:tcW w:w="2683" w:type="pct"/>
+            <w:tcW w:w="2612" w:type="pct"/>
             <w:shd w:val="clear" w:color="auto" w:fill="323E4F" w:themeFill="text2" w:themeFillShade="BF"/>
             <w:vAlign w:val="center"/>
           </w:tcPr>
@@ -2013,7 +1995,7 @@
         </w:tc>
         <w:tc>
           <w:tcPr>
-            <w:tcW w:w="473" w:type="pct"/>
+            <w:tcW w:w="584" w:type="pct"/>
             <w:shd w:val="clear" w:color="auto" w:fill="323E4F" w:themeFill="text2" w:themeFillShade="BF"/>
             <w:vAlign w:val="center"/>
           </w:tcPr>
@@ -2043,7 +2025,7 @@
         </w:tc>
         <w:tc>
           <w:tcPr>
-            <w:tcW w:w="473" w:type="pct"/>
+            <w:tcW w:w="502" w:type="pct"/>
             <w:shd w:val="clear" w:color="auto" w:fill="323E4F" w:themeFill="text2" w:themeFillShade="BF"/>
             <w:vAlign w:val="center"/>
           </w:tcPr>
@@ -2067,13 +2049,15 @@
                 <w:sz w:val="22"/>
                 <w:szCs w:val="22"/>
               </w:rPr>
-              <w:t>Percent</w:t>
-            </w:r>
+              <w:t>% Paid</w:t>
+            </w:r>
+            <w:bookmarkStart w:id="0" w:name="_GoBack"/>
+            <w:bookmarkEnd w:id="0"/>
           </w:p>
         </w:tc>
         <w:tc>
           <w:tcPr>
-            <w:tcW w:w="473" w:type="pct"/>
+            <w:tcW w:w="455" w:type="pct"/>
             <w:shd w:val="clear" w:color="auto" w:fill="323E4F" w:themeFill="text2" w:themeFillShade="BF"/>
             <w:vAlign w:val="center"/>
           </w:tcPr>
@@ -2103,7 +2087,7 @@
         </w:tc>
         <w:tc>
           <w:tcPr>
-            <w:tcW w:w="608" w:type="pct"/>
+            <w:tcW w:w="483" w:type="pct"/>
             <w:shd w:val="clear" w:color="auto" w:fill="323E4F" w:themeFill="text2" w:themeFillShade="BF"/>
             <w:vAlign w:val="center"/>
           </w:tcPr>
@@ -2137,7 +2121,7 @@
       <w:tr>
         <w:tc>
           <w:tcPr>
-            <w:tcW w:w="290" w:type="pct"/>
+            <w:tcW w:w="363" w:type="pct"/>
           </w:tcPr>
           <w:p>
             <w:pPr>
@@ -2171,6 +2155,8 @@
               </w:rPr>
               <w:t>«</w:t>
             </w:r>
+            <w:proofErr w:type="spellStart"/>
+            <w:proofErr w:type="gramStart"/>
             <w:r>
               <w:rPr>
                 <w:sz w:val="18"/>
@@ -2182,13 +2168,22 @@
                 <w:noProof/>
                 <w:sz w:val="18"/>
               </w:rPr>
-              <w:t>:pOrders»</w:t>
-            </w:r>
+              <w:t>:pOrders</w:t>
+            </w:r>
+            <w:proofErr w:type="spellEnd"/>
+            <w:proofErr w:type="gramEnd"/>
             <w:r>
               <w:rPr>
                 <w:noProof/>
                 <w:sz w:val="18"/>
               </w:rPr>
+              <w:t>»</w:t>
+            </w:r>
+            <w:r>
+              <w:rPr>
+                <w:noProof/>
+                <w:sz w:val="18"/>
+              </w:rPr>
               <w:fldChar w:fldCharType="end"/>
             </w:r>
             <w:r>
@@ -2214,15 +2209,7 @@
                 <w:noProof/>
                 <w:sz w:val="18"/>
               </w:rPr>
-              <w:t>«RowNumber</w:t>
-            </w:r>
-            <w:r>
-              <w:rPr>
-                <w:noProof/>
-                <w:sz w:val="18"/>
-              </w:rPr>
-              <w:lastRenderedPageBreak/>
-              <w:t>».</w:t>
+              <w:t>«RowNumber».</w:t>
             </w:r>
             <w:r>
               <w:rPr>
@@ -2235,10 +2222,11 @@
         </w:tc>
         <w:tc>
           <w:tcPr>
-            <w:tcW w:w="2683" w:type="pct"/>
+            <w:tcW w:w="2612" w:type="pct"/>
           </w:tcPr>
           <w:p>
             <w:pPr>
+              <w:keepLines/>
               <w:spacing w:before="0" w:after="200" w:line="276" w:lineRule="auto"/>
               <w:ind w:left="0" w:right="0"/>
               <w:contextualSpacing/>
@@ -2258,7 +2246,6 @@
                 <w:sz w:val="18"/>
                 <w:szCs w:val="22"/>
               </w:rPr>
-              <w:lastRenderedPageBreak/>
               <w:fldChar w:fldCharType="begin"/>
             </w:r>
             <w:r>
@@ -2305,6 +2292,7 @@
           </w:p>
           <w:p>
             <w:pPr>
+              <w:keepLines/>
               <w:spacing w:before="0" w:after="200" w:line="276" w:lineRule="auto"/>
               <w:ind w:left="0" w:right="0"/>
               <w:contextualSpacing/>
@@ -2446,6 +2434,7 @@
           </w:p>
           <w:p>
             <w:pPr>
+              <w:keepLines/>
               <w:spacing w:before="0" w:after="200" w:line="276" w:lineRule="auto"/>
               <w:ind w:left="0" w:right="0"/>
               <w:contextualSpacing/>
@@ -2506,7 +2495,7 @@
         </w:tc>
         <w:tc>
           <w:tcPr>
-            <w:tcW w:w="473" w:type="pct"/>
+            <w:tcW w:w="584" w:type="pct"/>
             <w:vAlign w:val="center"/>
           </w:tcPr>
           <w:p>
@@ -2632,7 +2621,7 @@
         </w:tc>
         <w:tc>
           <w:tcPr>
-            <w:tcW w:w="473" w:type="pct"/>
+            <w:tcW w:w="502" w:type="pct"/>
             <w:vAlign w:val="center"/>
           </w:tcPr>
           <w:p>
@@ -2698,7 +2687,7 @@
         </w:tc>
         <w:tc>
           <w:tcPr>
-            <w:tcW w:w="473" w:type="pct"/>
+            <w:tcW w:w="455" w:type="pct"/>
             <w:vAlign w:val="center"/>
           </w:tcPr>
           <w:p>
@@ -2764,7 +2753,7 @@
         </w:tc>
         <w:tc>
           <w:tcPr>
-            <w:tcW w:w="608" w:type="pct"/>
+            <w:tcW w:w="483" w:type="pct"/>
             <w:vAlign w:val="center"/>
           </w:tcPr>
           <w:p>
@@ -2900,6 +2889,7 @@
     </w:p>
     <w:p>
       <w:pPr>
+        <w:keepLines/>
         <w:spacing w:before="0" w:after="200" w:line="276" w:lineRule="auto"/>
         <w:ind w:left="0" w:right="0"/>
         <w:contextualSpacing/>
@@ -3264,9 +3254,9 @@
         </w:rPr>
       </w:pPr>
     </w:p>
-    <w:bookmarkStart w:id="0" w:name="OLE_LINK1"/>
-    <w:bookmarkStart w:id="1" w:name="OLE_LINK2"/>
-    <w:bookmarkStart w:id="2" w:name="OLE_LINK3"/>
+    <w:bookmarkStart w:id="1" w:name="OLE_LINK1"/>
+    <w:bookmarkStart w:id="2" w:name="OLE_LINK2"/>
+    <w:bookmarkStart w:id="3" w:name="OLE_LINK3"/>
     <w:p>
       <w:pPr>
         <w:spacing w:before="0" w:after="200" w:line="276" w:lineRule="auto"/>
@@ -3328,6 +3318,7 @@
     </w:p>
     <w:p>
       <w:pPr>
+        <w:keepNext/>
         <w:spacing w:before="0" w:after="200" w:line="276" w:lineRule="auto"/>
         <w:ind w:left="0" w:right="0"/>
         <w:contextualSpacing/>
@@ -3575,7 +3566,6 @@
           </w:p>
         </w:tc>
       </w:tr>
-      <w:bookmarkStart w:id="3" w:name="_GoBack" w:colFirst="4" w:colLast="4"/>
       <w:tr>
         <w:tc>
           <w:tcPr>
@@ -3585,35 +3575,42 @@
             <w:pPr>
               <w:jc w:val="right"/>
             </w:pPr>
-            <w:r>
-              <w:fldChar w:fldCharType="begin"/>
-            </w:r>
-            <w:r>
-              <w:instrText xml:space="preserve"> MERGEFIELD  RangeStart:uOrders  \* MERGEFORMAT </w:instrText>
-            </w:r>
-            <w:r>
-              <w:fldChar w:fldCharType="separate"/>
-            </w:r>
-            <w:r>
-              <w:rPr>
-                <w:noProof/>
-              </w:rPr>
-              <w:t>«RangeStart:uOrders»</w:t>
-            </w:r>
-            <w:r>
-              <w:rPr>
-                <w:noProof/>
-              </w:rPr>
-              <w:fldChar w:fldCharType="end"/>
-            </w:r>
-            <w:fldSimple w:instr=" MERGEFIELD  RowNumber \f .  \* MERGEFORMAT ">
+            <w:fldSimple w:instr=" MERGEFIELD  RangeStart:uOrders  \* MERGEFORMAT ">
               <w:r>
                 <w:rPr>
                   <w:noProof/>
                 </w:rPr>
-                <w:t>«RowNumber».</w:t>
+                <w:t>«Ra</w:t>
+              </w:r>
+              <w:r>
+                <w:rPr>
+                  <w:noProof/>
+                </w:rPr>
+                <w:lastRenderedPageBreak/>
+                <w:t>ngeStart:uOrders»</w:t>
               </w:r>
             </w:fldSimple>
+            <w:r>
+              <w:fldChar w:fldCharType="begin"/>
+            </w:r>
+            <w:r>
+              <w:instrText xml:space="preserve"> MERGEFIELD  RowNumber \f .  \* MERGEFORMAT </w:instrText>
+            </w:r>
+            <w:r>
+              <w:fldChar w:fldCharType="separate"/>
+            </w:r>
+            <w:r>
+              <w:rPr>
+                <w:noProof/>
+              </w:rPr>
+              <w:t>«RowNumber».</w:t>
+            </w:r>
+            <w:r>
+              <w:rPr>
+                <w:noProof/>
+              </w:rPr>
+              <w:fldChar w:fldCharType="end"/>
+            </w:r>
           </w:p>
         </w:tc>
         <w:tc>
@@ -3622,6 +3619,7 @@
           </w:tcPr>
           <w:p>
             <w:pPr>
+              <w:keepLines/>
               <w:spacing w:before="0" w:after="200" w:line="276" w:lineRule="auto"/>
               <w:ind w:left="0" w:right="0"/>
               <w:contextualSpacing/>
@@ -3641,6 +3639,7 @@
                 <w:sz w:val="22"/>
                 <w:szCs w:val="22"/>
               </w:rPr>
+              <w:lastRenderedPageBreak/>
               <w:fldChar w:fldCharType="begin"/>
             </w:r>
             <w:r>
@@ -3687,6 +3686,7 @@
           </w:p>
           <w:p>
             <w:pPr>
+              <w:keepLines/>
               <w:spacing w:before="0" w:after="200" w:line="276" w:lineRule="auto"/>
               <w:ind w:left="0" w:right="0"/>
               <w:contextualSpacing/>
@@ -3828,6 +3828,7 @@
           </w:p>
           <w:p>
             <w:pPr>
+              <w:keepLines/>
               <w:spacing w:before="0" w:after="200" w:line="276" w:lineRule="auto"/>
               <w:ind w:left="0" w:right="0"/>
               <w:contextualSpacing/>
@@ -3845,6 +3846,7 @@
                 <w:sz w:val="22"/>
                 <w:szCs w:val="22"/>
               </w:rPr>
+              <w:lastRenderedPageBreak/>
               <w:fldChar w:fldCharType="begin"/>
             </w:r>
             <w:r>
@@ -3908,6 +3910,7 @@
                 <w:color w:val="auto"/>
                 <w:szCs w:val="22"/>
               </w:rPr>
+              <w:lastRenderedPageBreak/>
               <w:fldChar w:fldCharType="begin"/>
             </w:r>
             <w:r>
@@ -3956,35 +3959,23 @@
                 <w:sz w:val="22"/>
               </w:rPr>
             </w:pPr>
-            <w:r>
-              <w:fldChar w:fldCharType="begin"/>
-            </w:r>
-            <w:r>
-              <w:instrText xml:space="preserve"> MERGEFIELD  AdjustedRoyalty  \* MERGEFORMAT </w:instrText>
-            </w:r>
-            <w:r>
-              <w:fldChar w:fldCharType="separate"/>
-            </w:r>
-            <w:r>
-              <w:rPr>
-                <w:noProof/>
-              </w:rPr>
-              <w:t>«</w:t>
-            </w:r>
-            <w:proofErr w:type="spellStart"/>
-            <w:r>
-              <w:t>AdjustedRoyalty</w:t>
-            </w:r>
-            <w:proofErr w:type="spellEnd"/>
-            <w:r>
-              <w:rPr>
-                <w:noProof/>
-              </w:rPr>
-              <w:t>»</w:t>
-            </w:r>
-            <w:r>
-              <w:fldChar w:fldCharType="end"/>
-            </w:r>
+            <w:fldSimple w:instr=" MERGEFIELD  AdjustedRoyalty  \* MERGEFORMAT ">
+              <w:r>
+                <w:rPr>
+                  <w:noProof/>
+                </w:rPr>
+                <w:t>«</w:t>
+              </w:r>
+              <w:r>
+                <w:t>AdjustedRoyalty</w:t>
+              </w:r>
+              <w:r>
+                <w:rPr>
+                  <w:noProof/>
+                </w:rPr>
+                <w:t>»</w:t>
+              </w:r>
+            </w:fldSimple>
           </w:p>
         </w:tc>
         <w:tc>
@@ -4042,18 +4033,30 @@
               </w:rPr>
               <w:t xml:space="preserve"> </w:t>
             </w:r>
-            <w:fldSimple w:instr=" MERGEFIELD  RangeEnd:uOrders  \* MERGEFORMAT ">
-              <w:r>
-                <w:rPr>
-                  <w:noProof/>
-                </w:rPr>
-                <w:t>«RangeEnd:uOrders»</w:t>
-              </w:r>
-            </w:fldSimple>
+            <w:r>
+              <w:fldChar w:fldCharType="begin"/>
+            </w:r>
+            <w:r>
+              <w:instrText xml:space="preserve"> MERGEFIELD  RangeEnd:uOrders  \* MERGEFORMAT </w:instrText>
+            </w:r>
+            <w:r>
+              <w:fldChar w:fldCharType="separate"/>
+            </w:r>
+            <w:r>
+              <w:rPr>
+                <w:noProof/>
+              </w:rPr>
+              <w:t>«RangeEnd:uOrders»</w:t>
+            </w:r>
+            <w:r>
+              <w:rPr>
+                <w:noProof/>
+              </w:rPr>
+              <w:fldChar w:fldCharType="end"/>
+            </w:r>
           </w:p>
         </w:tc>
       </w:tr>
-      <w:bookmarkEnd w:id="3"/>
     </w:tbl>
     <w:p>
       <w:pPr>
@@ -4070,6 +4073,7 @@
     </w:p>
     <w:p>
       <w:pPr>
+        <w:keepLines/>
         <w:spacing w:before="0" w:after="200" w:line="276" w:lineRule="auto"/>
         <w:ind w:left="0" w:right="0"/>
         <w:contextualSpacing/>
@@ -4436,9 +4440,9 @@
         </w:rPr>
       </w:pPr>
     </w:p>
-    <w:bookmarkEnd w:id="0"/>
     <w:bookmarkEnd w:id="1"/>
     <w:bookmarkEnd w:id="2"/>
+    <w:bookmarkEnd w:id="3"/>
     <w:p>
       <w:pPr>
         <w:tabs>
@@ -4937,7 +4941,7 @@
       </w:pPr>
     </w:pPrDefault>
   </w:docDefaults>
-  <w:latentStyles w:defLockedState="0" w:defUIPriority="99" w:defSemiHidden="0" w:defUnhideWhenUsed="0" w:defQFormat="0" w:count="372">
+  <w:latentStyles w:defLockedState="0" w:defUIPriority="99" w:defSemiHidden="0" w:defUnhideWhenUsed="0" w:defQFormat="0" w:count="373">
     <w:lsdException w:name="Normal" w:uiPriority="0" w:qFormat="1"/>
     <w:lsdException w:name="heading 1" w:uiPriority="9" w:qFormat="1"/>
     <w:lsdException w:name="heading 2" w:semiHidden="1" w:uiPriority="9" w:unhideWhenUsed="1" w:qFormat="1"/>
@@ -5310,6 +5314,7 @@
     <w:lsdException w:name="List Table 6 Colorful Accent 6" w:uiPriority="51"/>
     <w:lsdException w:name="List Table 7 Colorful Accent 6" w:uiPriority="52"/>
     <w:lsdException w:name="Mention" w:semiHidden="1" w:unhideWhenUsed="1"/>
+    <w:lsdException w:name="Smart Hyperlink" w:semiHidden="1" w:unhideWhenUsed="1"/>
   </w:latentStyles>
   <w:style w:type="paragraph" w:default="1" w:styleId="Normal">
     <w:name w:val="Normal"/>

</xml_diff>

<commit_message>
Add 50% CommissionModel Adds Affiliate Editing Add label for Unlimited Sub to invoice generator
</commit_message>
<xml_diff>
--- a/CUWebinars.Web/App_Data/mergeTemplates/WeeklyInvoice.docx
+++ b/CUWebinars.Web/App_Data/mergeTemplates/WeeklyInvoice.docx
@@ -1,6 +1,6 @@
 
 <file path=word/document.xml><?xml version="1.0" encoding="utf-8"?>
-<w:document xmlns:wpc="http://schemas.microsoft.com/office/word/2010/wordprocessingCanvas" xmlns:cx="http://schemas.microsoft.com/office/drawing/2014/chartex" xmlns:cx1="http://schemas.microsoft.com/office/drawing/2015/9/8/chartex" xmlns:cx2="http://schemas.microsoft.com/office/drawing/2015/10/21/chartex" xmlns:mc="http://schemas.openxmlformats.org/markup-compatibility/2006" xmlns:o="urn:schemas-microsoft-com:office:office" xmlns:r="http://schemas.openxmlformats.org/officeDocument/2006/relationships" xmlns:m="http://schemas.openxmlformats.org/officeDocument/2006/math" xmlns:v="urn:schemas-microsoft-com:vml" xmlns:wp14="http://schemas.microsoft.com/office/word/2010/wordprocessingDrawing" xmlns:wp="http://schemas.openxmlformats.org/drawingml/2006/wordprocessingDrawing" xmlns:w10="urn:schemas-microsoft-com:office:word" xmlns:w="http://schemas.openxmlformats.org/wordprocessingml/2006/main" xmlns:w14="http://schemas.microsoft.com/office/word/2010/wordml" xmlns:w15="http://schemas.microsoft.com/office/word/2012/wordml" xmlns:w16se="http://schemas.microsoft.com/office/word/2015/wordml/symex" xmlns:wpg="http://schemas.microsoft.com/office/word/2010/wordprocessingGroup" xmlns:wpi="http://schemas.microsoft.com/office/word/2010/wordprocessingInk" xmlns:wne="http://schemas.microsoft.com/office/word/2006/wordml" xmlns:wps="http://schemas.microsoft.com/office/word/2010/wordprocessingShape" mc:Ignorable="w14 w15 w16se wp14">
+<w:document xmlns:wpc="http://schemas.microsoft.com/office/word/2010/wordprocessingCanvas" xmlns:cx="http://schemas.microsoft.com/office/drawing/2014/chartex" xmlns:cx1="http://schemas.microsoft.com/office/drawing/2015/9/8/chartex" xmlns:cx2="http://schemas.microsoft.com/office/drawing/2015/10/21/chartex" xmlns:cx3="http://schemas.microsoft.com/office/drawing/2016/5/9/chartex" xmlns:cx4="http://schemas.microsoft.com/office/drawing/2016/5/10/chartex" xmlns:cx5="http://schemas.microsoft.com/office/drawing/2016/5/11/chartex" xmlns:mc="http://schemas.openxmlformats.org/markup-compatibility/2006" xmlns:o="urn:schemas-microsoft-com:office:office" xmlns:r="http://schemas.openxmlformats.org/officeDocument/2006/relationships" xmlns:m="http://schemas.openxmlformats.org/officeDocument/2006/math" xmlns:v="urn:schemas-microsoft-com:vml" xmlns:wp14="http://schemas.microsoft.com/office/word/2010/wordprocessingDrawing" xmlns:wp="http://schemas.openxmlformats.org/drawingml/2006/wordprocessingDrawing" xmlns:w10="urn:schemas-microsoft-com:office:word" xmlns:w="http://schemas.openxmlformats.org/wordprocessingml/2006/main" xmlns:w14="http://schemas.microsoft.com/office/word/2010/wordml" xmlns:w15="http://schemas.microsoft.com/office/word/2012/wordml" xmlns:w16se="http://schemas.microsoft.com/office/word/2015/wordml/symex" xmlns:wpg="http://schemas.microsoft.com/office/word/2010/wordprocessingGroup" xmlns:wpi="http://schemas.microsoft.com/office/word/2010/wordprocessingInk" xmlns:wne="http://schemas.microsoft.com/office/word/2006/wordml" xmlns:wps="http://schemas.microsoft.com/office/word/2010/wordprocessingShape" mc:Ignorable="w14 w15 w16se wp14">
   <w:body>
     <w:p>
       <w:pPr>
@@ -248,77 +248,6 @@
         </w:rPr>
         <w:fldChar w:fldCharType="end"/>
       </w:r>
-      <w:r>
-        <w:rPr>
-          <w:rFonts w:eastAsia="Times New Roman" w:cs="Times New Roman"/>
-          <w:color w:val="auto"/>
-          <w:sz w:val="22"/>
-          <w:szCs w:val="22"/>
-        </w:rPr>
-        <w:t xml:space="preserve"> - </w:t>
-      </w:r>
-      <w:r>
-        <w:rPr>
-          <w:rFonts w:eastAsia="Times New Roman" w:cs="Times New Roman"/>
-          <w:color w:val="auto"/>
-          <w:sz w:val="22"/>
-          <w:szCs w:val="22"/>
-        </w:rPr>
-        <w:fldChar w:fldCharType="begin"/>
-      </w:r>
-      <w:r>
-        <w:rPr>
-          <w:rFonts w:eastAsia="Times New Roman" w:cs="Times New Roman"/>
-          <w:color w:val="auto"/>
-          <w:sz w:val="22"/>
-          <w:szCs w:val="22"/>
-        </w:rPr>
-        <w:instrText xml:space="preserve"> MERGEFIELD  RoyaltyTier  \* MERGEFORMAT </w:instrText>
-      </w:r>
-      <w:r>
-        <w:rPr>
-          <w:rFonts w:eastAsia="Times New Roman" w:cs="Times New Roman"/>
-          <w:color w:val="auto"/>
-          <w:sz w:val="22"/>
-          <w:szCs w:val="22"/>
-        </w:rPr>
-        <w:fldChar w:fldCharType="separate"/>
-      </w:r>
-      <w:r>
-        <w:rPr>
-          <w:rFonts w:eastAsia="Times New Roman" w:cs="Times New Roman"/>
-          <w:noProof/>
-          <w:color w:val="auto"/>
-          <w:sz w:val="22"/>
-          <w:szCs w:val="22"/>
-        </w:rPr>
-        <w:t>«RoyaltyTier»</w:t>
-      </w:r>
-      <w:r>
-        <w:rPr>
-          <w:rFonts w:eastAsia="Times New Roman" w:cs="Times New Roman"/>
-          <w:color w:val="auto"/>
-          <w:sz w:val="22"/>
-          <w:szCs w:val="22"/>
-        </w:rPr>
-        <w:fldChar w:fldCharType="end"/>
-      </w:r>
-    </w:p>
-    <w:p>
-      <w:pPr>
-        <w:tabs>
-          <w:tab w:val="right" w:pos="12780"/>
-        </w:tabs>
-        <w:spacing w:before="0" w:after="200" w:line="276" w:lineRule="auto"/>
-        <w:ind w:left="0" w:right="0"/>
-        <w:contextualSpacing/>
-        <w:rPr>
-          <w:rFonts w:eastAsia="Times New Roman" w:cs="Times New Roman"/>
-          <w:color w:val="auto"/>
-          <w:sz w:val="22"/>
-          <w:szCs w:val="22"/>
-        </w:rPr>
-      </w:pPr>
     </w:p>
     <w:p>
       <w:pPr>
@@ -727,7 +656,6 @@
                 <w:szCs w:val="22"/>
               </w:rPr>
             </w:pPr>
-            <w:proofErr w:type="spellStart"/>
             <w:r>
               <w:rPr>
                 <w:rFonts w:eastAsia="Times New Roman" w:cs="Times New Roman"/>
@@ -737,7 +665,6 @@
               </w:rPr>
               <w:t>OrderID</w:t>
             </w:r>
-            <w:proofErr w:type="spellEnd"/>
           </w:p>
         </w:tc>
       </w:tr>
@@ -1863,7 +1790,6 @@
         </w:rPr>
         <w:t xml:space="preserve">ast </w:t>
       </w:r>
-      <w:proofErr w:type="gramStart"/>
       <w:r>
         <w:rPr>
           <w:rFonts w:eastAsia="Times New Roman" w:cs="Times New Roman"/>
@@ -1906,15 +1832,34 @@
         </w:rPr>
         <w:t xml:space="preserve"> (</w:t>
       </w:r>
-      <w:proofErr w:type="gramEnd"/>
-      <w:r>
-        <w:rPr>
-          <w:rFonts w:eastAsia="Times New Roman" w:cs="Times New Roman"/>
-          <w:color w:val="auto"/>
-          <w:sz w:val="22"/>
-          <w:szCs w:val="22"/>
-        </w:rPr>
-        <w:t xml:space="preserve">These </w:t>
+      <w:r>
+        <w:rPr>
+          <w:rFonts w:eastAsia="Times New Roman" w:cs="Times New Roman"/>
+          <w:color w:val="auto"/>
+          <w:sz w:val="22"/>
+          <w:szCs w:val="22"/>
+        </w:rPr>
+        <w:t>These</w:t>
+      </w:r>
+      <w:r>
+        <w:rPr>
+          <w:rFonts w:eastAsia="Times New Roman" w:cs="Times New Roman"/>
+          <w:color w:val="auto"/>
+          <w:sz w:val="22"/>
+          <w:szCs w:val="22"/>
+        </w:rPr>
+        <w:t xml:space="preserve"> are</w:t>
+      </w:r>
+      <w:bookmarkStart w:id="0" w:name="_GoBack"/>
+      <w:bookmarkEnd w:id="0"/>
+      <w:r>
+        <w:rPr>
+          <w:rFonts w:eastAsia="Times New Roman" w:cs="Times New Roman"/>
+          <w:color w:val="auto"/>
+          <w:sz w:val="22"/>
+          <w:szCs w:val="22"/>
+        </w:rPr>
+        <w:t xml:space="preserve"> </w:t>
       </w:r>
       <w:r>
         <w:rPr>
@@ -2051,8 +1996,6 @@
               </w:rPr>
               <w:t>% Paid</w:t>
             </w:r>
-            <w:bookmarkStart w:id="0" w:name="_GoBack"/>
-            <w:bookmarkEnd w:id="0"/>
           </w:p>
         </w:tc>
         <w:tc>
@@ -2104,7 +2047,6 @@
                 <w:szCs w:val="22"/>
               </w:rPr>
             </w:pPr>
-            <w:proofErr w:type="spellStart"/>
             <w:r>
               <w:rPr>
                 <w:rFonts w:eastAsia="Times New Roman" w:cs="Times New Roman"/>
@@ -2114,7 +2056,6 @@
               </w:rPr>
               <w:t>OrderID</w:t>
             </w:r>
-            <w:proofErr w:type="spellEnd"/>
           </w:p>
         </w:tc>
       </w:tr>
@@ -2155,8 +2096,6 @@
               </w:rPr>
               <w:t>«</w:t>
             </w:r>
-            <w:proofErr w:type="spellStart"/>
-            <w:proofErr w:type="gramStart"/>
             <w:r>
               <w:rPr>
                 <w:sz w:val="18"/>
@@ -2168,16 +2107,7 @@
                 <w:noProof/>
                 <w:sz w:val="18"/>
               </w:rPr>
-              <w:t>:pOrders</w:t>
-            </w:r>
-            <w:proofErr w:type="spellEnd"/>
-            <w:proofErr w:type="gramEnd"/>
-            <w:r>
-              <w:rPr>
-                <w:noProof/>
-                <w:sz w:val="18"/>
-              </w:rPr>
-              <w:t>»</w:t>
+              <w:t>:pOrders»</w:t>
             </w:r>
             <w:r>
               <w:rPr>
@@ -3340,19 +3270,7 @@
           <w:sz w:val="26"/>
           <w:szCs w:val="26"/>
         </w:rPr>
-        <w:t xml:space="preserve">Upgrades and </w:t>
-      </w:r>
-      <w:proofErr w:type="gramStart"/>
-      <w:r>
-        <w:rPr>
-          <w:rFonts w:eastAsia="Times New Roman" w:cs="Times New Roman"/>
-          <w:b/>
-          <w:i/>
-          <w:color w:val="auto"/>
-          <w:sz w:val="26"/>
-          <w:szCs w:val="26"/>
-        </w:rPr>
-        <w:t xml:space="preserve">Adjustments </w:t>
+        <w:t xml:space="preserve">Upgrades and Adjustments </w:t>
       </w:r>
       <w:r>
         <w:rPr>
@@ -3363,7 +3281,6 @@
         </w:rPr>
         <w:t xml:space="preserve"> (</w:t>
       </w:r>
-      <w:proofErr w:type="gramEnd"/>
       <w:r>
         <w:rPr>
           <w:rFonts w:eastAsia="Times New Roman" w:cs="Times New Roman"/>
@@ -3575,42 +3492,42 @@
             <w:pPr>
               <w:jc w:val="right"/>
             </w:pPr>
-            <w:fldSimple w:instr=" MERGEFIELD  RangeStart:uOrders  \* MERGEFORMAT ">
+            <w:r>
+              <w:fldChar w:fldCharType="begin"/>
+            </w:r>
+            <w:r>
+              <w:instrText xml:space="preserve"> MERGEFIELD  RangeStart:uOrders  \* MERGEFORMAT </w:instrText>
+            </w:r>
+            <w:r>
+              <w:fldChar w:fldCharType="separate"/>
+            </w:r>
+            <w:r>
+              <w:rPr>
+                <w:noProof/>
+              </w:rPr>
+              <w:t>«Ran</w:t>
+            </w:r>
+            <w:r>
+              <w:rPr>
+                <w:noProof/>
+              </w:rPr>
+              <w:lastRenderedPageBreak/>
+              <w:t>geStart:uOrders»</w:t>
+            </w:r>
+            <w:r>
+              <w:rPr>
+                <w:noProof/>
+              </w:rPr>
+              <w:fldChar w:fldCharType="end"/>
+            </w:r>
+            <w:fldSimple w:instr=" MERGEFIELD  RowNumber \f .  \* MERGEFORMAT ">
               <w:r>
                 <w:rPr>
                   <w:noProof/>
                 </w:rPr>
-                <w:t>«Ra</w:t>
-              </w:r>
-              <w:r>
-                <w:rPr>
-                  <w:noProof/>
-                </w:rPr>
-                <w:lastRenderedPageBreak/>
-                <w:t>ngeStart:uOrders»</w:t>
+                <w:t>«RowNumber».</w:t>
               </w:r>
             </w:fldSimple>
-            <w:r>
-              <w:fldChar w:fldCharType="begin"/>
-            </w:r>
-            <w:r>
-              <w:instrText xml:space="preserve"> MERGEFIELD  RowNumber \f .  \* MERGEFORMAT </w:instrText>
-            </w:r>
-            <w:r>
-              <w:fldChar w:fldCharType="separate"/>
-            </w:r>
-            <w:r>
-              <w:rPr>
-                <w:noProof/>
-              </w:rPr>
-              <w:t>«RowNumber».</w:t>
-            </w:r>
-            <w:r>
-              <w:rPr>
-                <w:noProof/>
-              </w:rPr>
-              <w:fldChar w:fldCharType="end"/>
-            </w:r>
           </w:p>
         </w:tc>
         <w:tc>
@@ -3846,7 +3763,6 @@
                 <w:sz w:val="22"/>
                 <w:szCs w:val="22"/>
               </w:rPr>
-              <w:lastRenderedPageBreak/>
               <w:fldChar w:fldCharType="begin"/>
             </w:r>
             <w:r>
@@ -3910,7 +3826,6 @@
                 <w:color w:val="auto"/>
                 <w:szCs w:val="22"/>
               </w:rPr>
-              <w:lastRenderedPageBreak/>
               <w:fldChar w:fldCharType="begin"/>
             </w:r>
             <w:r>
@@ -3959,23 +3874,36 @@
                 <w:sz w:val="22"/>
               </w:rPr>
             </w:pPr>
-            <w:fldSimple w:instr=" MERGEFIELD  AdjustedRoyalty  \* MERGEFORMAT ">
-              <w:r>
-                <w:rPr>
-                  <w:noProof/>
-                </w:rPr>
-                <w:t>«</w:t>
-              </w:r>
-              <w:r>
-                <w:t>AdjustedRoyalty</w:t>
-              </w:r>
-              <w:r>
-                <w:rPr>
-                  <w:noProof/>
-                </w:rPr>
-                <w:t>»</w:t>
-              </w:r>
-            </w:fldSimple>
+            <w:r>
+              <w:fldChar w:fldCharType="begin"/>
+            </w:r>
+            <w:r>
+              <w:instrText xml:space="preserve"> MERGEFIELD  AdjustedRoyalty  \* MERGEFORMAT </w:instrText>
+            </w:r>
+            <w:r>
+              <w:fldChar w:fldCharType="separate"/>
+            </w:r>
+            <w:r>
+              <w:rPr>
+                <w:noProof/>
+              </w:rPr>
+              <w:t>«</w:t>
+            </w:r>
+            <w:r>
+              <w:t>AdjustedRoyalty</w:t>
+            </w:r>
+            <w:r>
+              <w:rPr>
+                <w:noProof/>
+              </w:rPr>
+              <w:t>»</w:t>
+            </w:r>
+            <w:r>
+              <w:rPr>
+                <w:noProof/>
+              </w:rPr>
+              <w:fldChar w:fldCharType="end"/>
+            </w:r>
           </w:p>
         </w:tc>
         <w:tc>
@@ -4033,27 +3961,14 @@
               </w:rPr>
               <w:t xml:space="preserve"> </w:t>
             </w:r>
-            <w:r>
-              <w:fldChar w:fldCharType="begin"/>
-            </w:r>
-            <w:r>
-              <w:instrText xml:space="preserve"> MERGEFIELD  RangeEnd:uOrders  \* MERGEFORMAT </w:instrText>
-            </w:r>
-            <w:r>
-              <w:fldChar w:fldCharType="separate"/>
-            </w:r>
-            <w:r>
-              <w:rPr>
-                <w:noProof/>
-              </w:rPr>
-              <w:t>«RangeEnd:uOrders»</w:t>
-            </w:r>
-            <w:r>
-              <w:rPr>
-                <w:noProof/>
-              </w:rPr>
-              <w:fldChar w:fldCharType="end"/>
-            </w:r>
+            <w:fldSimple w:instr=" MERGEFIELD  RangeEnd:uOrders  \* MERGEFORMAT ">
+              <w:r>
+                <w:rPr>
+                  <w:noProof/>
+                </w:rPr>
+                <w:t>«RangeEnd:uOrders»</w:t>
+              </w:r>
+            </w:fldSimple>
           </w:p>
         </w:tc>
       </w:tr>
@@ -4941,7 +4856,7 @@
       </w:pPr>
     </w:pPrDefault>
   </w:docDefaults>
-  <w:latentStyles w:defLockedState="0" w:defUIPriority="99" w:defSemiHidden="0" w:defUnhideWhenUsed="0" w:defQFormat="0" w:count="373">
+  <w:latentStyles w:defLockedState="0" w:defUIPriority="99" w:defSemiHidden="0" w:defUnhideWhenUsed="0" w:defQFormat="0" w:count="374">
     <w:lsdException w:name="Normal" w:uiPriority="0" w:qFormat="1"/>
     <w:lsdException w:name="heading 1" w:uiPriority="9" w:qFormat="1"/>
     <w:lsdException w:name="heading 2" w:semiHidden="1" w:uiPriority="9" w:unhideWhenUsed="1" w:qFormat="1"/>
@@ -5047,7 +4962,6 @@
     <w:lsdException w:name="HTML Sample" w:semiHidden="1" w:unhideWhenUsed="1"/>
     <w:lsdException w:name="HTML Typewriter" w:semiHidden="1" w:unhideWhenUsed="1"/>
     <w:lsdException w:name="HTML Variable" w:semiHidden="1" w:unhideWhenUsed="1"/>
-    <w:lsdException w:name="Normal Table" w:semiHidden="1" w:unhideWhenUsed="1"/>
     <w:lsdException w:name="annotation subject" w:semiHidden="1" w:unhideWhenUsed="1"/>
     <w:lsdException w:name="No List" w:semiHidden="1" w:unhideWhenUsed="1"/>
     <w:lsdException w:name="Outline List 1" w:semiHidden="1" w:unhideWhenUsed="1"/>
@@ -5094,10 +5008,8 @@
     <w:lsdException w:name="Table Subtle 2" w:semiHidden="1" w:unhideWhenUsed="1"/>
     <w:lsdException w:name="Table Web 1" w:semiHidden="1" w:unhideWhenUsed="1"/>
     <w:lsdException w:name="Table Web 2" w:semiHidden="1" w:unhideWhenUsed="1"/>
-    <w:lsdException w:name="Table Web 3" w:semiHidden="1" w:unhideWhenUsed="1"/>
     <w:lsdException w:name="Balloon Text" w:semiHidden="1" w:unhideWhenUsed="1"/>
     <w:lsdException w:name="Table Grid" w:uiPriority="39"/>
-    <w:lsdException w:name="Table Theme" w:semiHidden="1" w:unhideWhenUsed="1"/>
     <w:lsdException w:name="Placeholder Text" w:semiHidden="1"/>
     <w:lsdException w:name="No Spacing" w:uiPriority="1" w:qFormat="1"/>
     <w:lsdException w:name="Light Shading" w:uiPriority="60"/>
@@ -5315,6 +5227,7 @@
     <w:lsdException w:name="List Table 7 Colorful Accent 6" w:uiPriority="52"/>
     <w:lsdException w:name="Mention" w:semiHidden="1" w:unhideWhenUsed="1"/>
     <w:lsdException w:name="Smart Hyperlink" w:semiHidden="1" w:unhideWhenUsed="1"/>
+    <w:lsdException w:name="Hashtag" w:semiHidden="1" w:unhideWhenUsed="1"/>
   </w:latentStyles>
   <w:style w:type="paragraph" w:default="1" w:styleId="Normal">
     <w:name w:val="Normal"/>

</xml_diff>

<commit_message>
Implement Word Merge file export of Recording Is Posted notification.
</commit_message>
<xml_diff>
--- a/CUWebinars.Web/App_Data/mergeTemplates/WeeklyInvoice.docx
+++ b/CUWebinars.Web/App_Data/mergeTemplates/WeeklyInvoice.docx
@@ -17,61 +17,8 @@
           <w:szCs w:val="22"/>
         </w:rPr>
       </w:pPr>
-      <w:r>
-        <w:rPr>
-          <w:rFonts w:eastAsia="Times New Roman" w:cs="Times New Roman"/>
-          <w:color w:val="auto"/>
-          <w:sz w:val="22"/>
-          <w:szCs w:val="22"/>
-        </w:rPr>
-        <w:t xml:space="preserve">Invoice Number: </w:t>
-      </w:r>
-      <w:r>
-        <w:rPr>
-          <w:rFonts w:eastAsia="Times New Roman" w:cs="Times New Roman"/>
-          <w:color w:val="auto"/>
-          <w:sz w:val="22"/>
-          <w:szCs w:val="22"/>
-        </w:rPr>
-        <w:fldChar w:fldCharType="begin"/>
-      </w:r>
-      <w:r>
-        <w:rPr>
-          <w:rFonts w:eastAsia="Times New Roman" w:cs="Times New Roman"/>
-          <w:color w:val="auto"/>
-          <w:sz w:val="22"/>
-          <w:szCs w:val="22"/>
-        </w:rPr>
-        <w:instrText xml:space="preserve"> MERGEFIELD  InvoiceID  \* MERGEFORMAT </w:instrText>
-      </w:r>
-      <w:r>
-        <w:rPr>
-          <w:rFonts w:eastAsia="Times New Roman" w:cs="Times New Roman"/>
-          <w:color w:val="auto"/>
-          <w:sz w:val="22"/>
-          <w:szCs w:val="22"/>
-        </w:rPr>
-        <w:fldChar w:fldCharType="separate"/>
-      </w:r>
-      <w:r>
-        <w:rPr>
-          <w:rFonts w:eastAsia="Times New Roman" w:cs="Times New Roman"/>
-          <w:noProof/>
-          <w:color w:val="auto"/>
-          <w:sz w:val="22"/>
-          <w:szCs w:val="22"/>
-        </w:rPr>
-        <w:t>«InvoiceID»</w:t>
-      </w:r>
-      <w:r>
-        <w:rPr>
-          <w:rFonts w:eastAsia="Times New Roman" w:cs="Times New Roman"/>
-          <w:color w:val="auto"/>
-          <w:sz w:val="22"/>
-          <w:szCs w:val="22"/>
-        </w:rPr>
-        <w:fldChar w:fldCharType="end"/>
-      </w:r>
+      <w:bookmarkStart w:id="0" w:name="_GoBack"/>
+      <w:bookmarkEnd w:id="0"/>
       <w:r>
         <w:rPr>
           <w:rFonts w:eastAsia="Times New Roman" w:cs="Times New Roman"/>
@@ -81,174 +28,358 @@
         </w:rPr>
         <w:tab/>
       </w:r>
-      <w:r>
-        <w:rPr>
-          <w:rFonts w:eastAsia="Times New Roman" w:cs="Times New Roman"/>
-          <w:color w:val="auto"/>
-          <w:sz w:val="22"/>
-          <w:szCs w:val="22"/>
-        </w:rPr>
-        <w:fldChar w:fldCharType="begin"/>
-      </w:r>
-      <w:r>
-        <w:rPr>
-          <w:rFonts w:eastAsia="Times New Roman" w:cs="Times New Roman"/>
-          <w:color w:val="auto"/>
-          <w:sz w:val="22"/>
-          <w:szCs w:val="22"/>
-        </w:rPr>
-        <w:instrText xml:space="preserve"> MERGEFIELD  DateRange  \* MERGEFORMAT </w:instrText>
-      </w:r>
-      <w:r>
-        <w:rPr>
-          <w:rFonts w:eastAsia="Times New Roman" w:cs="Times New Roman"/>
-          <w:color w:val="auto"/>
-          <w:sz w:val="22"/>
-          <w:szCs w:val="22"/>
-        </w:rPr>
-        <w:fldChar w:fldCharType="separate"/>
-      </w:r>
-      <w:r>
-        <w:rPr>
-          <w:rFonts w:eastAsia="Times New Roman" w:cs="Times New Roman"/>
-          <w:noProof/>
-          <w:color w:val="auto"/>
-          <w:sz w:val="22"/>
-          <w:szCs w:val="22"/>
-        </w:rPr>
-        <w:t>«DateRange»</w:t>
-      </w:r>
-      <w:r>
-        <w:rPr>
-          <w:rFonts w:eastAsia="Times New Roman" w:cs="Times New Roman"/>
-          <w:color w:val="auto"/>
-          <w:sz w:val="22"/>
-          <w:szCs w:val="22"/>
-        </w:rPr>
-        <w:fldChar w:fldCharType="end"/>
-      </w:r>
     </w:p>
-    <w:p>
-      <w:pPr>
-        <w:tabs>
-          <w:tab w:val="right" w:pos="12780"/>
-        </w:tabs>
-        <w:spacing w:before="0" w:after="200" w:line="276" w:lineRule="auto"/>
-        <w:ind w:left="0" w:right="0"/>
-        <w:contextualSpacing/>
-        <w:rPr>
-          <w:rFonts w:eastAsia="Times New Roman" w:cs="Times New Roman"/>
-          <w:color w:val="auto"/>
-          <w:sz w:val="22"/>
-          <w:szCs w:val="22"/>
-        </w:rPr>
-      </w:pPr>
-      <w:r>
-        <w:rPr>
-          <w:rFonts w:eastAsia="Times New Roman" w:cs="Times New Roman"/>
-          <w:color w:val="auto"/>
-          <w:sz w:val="22"/>
-          <w:szCs w:val="22"/>
-        </w:rPr>
-        <w:t xml:space="preserve">From: </w:t>
-      </w:r>
-      <w:r>
-        <w:rPr>
-          <w:rFonts w:eastAsia="Times New Roman" w:cs="Times New Roman"/>
-          <w:color w:val="auto"/>
-          <w:sz w:val="22"/>
-          <w:szCs w:val="22"/>
-        </w:rPr>
-        <w:t>Total Training Solutions</w:t>
-      </w:r>
-    </w:p>
-    <w:p>
-      <w:pPr>
-        <w:tabs>
-          <w:tab w:val="right" w:pos="12780"/>
-        </w:tabs>
-        <w:spacing w:before="0" w:after="200" w:line="276" w:lineRule="auto"/>
-        <w:ind w:left="0" w:right="0"/>
-        <w:contextualSpacing/>
-        <w:rPr>
-          <w:rFonts w:eastAsia="Times New Roman" w:cs="Times New Roman"/>
-          <w:color w:val="auto"/>
-          <w:sz w:val="22"/>
-          <w:szCs w:val="22"/>
-        </w:rPr>
-      </w:pPr>
-    </w:p>
-    <w:p>
-      <w:pPr>
-        <w:tabs>
-          <w:tab w:val="right" w:pos="12780"/>
-        </w:tabs>
-        <w:spacing w:before="0" w:after="200" w:line="276" w:lineRule="auto"/>
-        <w:ind w:left="0" w:right="0"/>
-        <w:contextualSpacing/>
-        <w:rPr>
-          <w:rFonts w:eastAsia="Times New Roman" w:cs="Times New Roman"/>
-          <w:color w:val="auto"/>
-          <w:sz w:val="22"/>
-          <w:szCs w:val="22"/>
-        </w:rPr>
-      </w:pPr>
-      <w:r>
-        <w:rPr>
-          <w:rFonts w:eastAsia="Times New Roman" w:cs="Times New Roman"/>
-          <w:color w:val="auto"/>
-          <w:sz w:val="22"/>
-          <w:szCs w:val="22"/>
-        </w:rPr>
-        <w:t xml:space="preserve">To: </w:t>
-      </w:r>
-      <w:r>
-        <w:rPr>
-          <w:rFonts w:eastAsia="Times New Roman" w:cs="Times New Roman"/>
-          <w:color w:val="auto"/>
-          <w:sz w:val="22"/>
-          <w:szCs w:val="22"/>
-        </w:rPr>
-        <w:fldChar w:fldCharType="begin"/>
-      </w:r>
-      <w:r>
-        <w:rPr>
-          <w:rFonts w:eastAsia="Times New Roman" w:cs="Times New Roman"/>
-          <w:color w:val="auto"/>
-          <w:sz w:val="22"/>
-          <w:szCs w:val="22"/>
-        </w:rPr>
-        <w:instrText xml:space="preserve"> MERGEFIELD  DisplayTitle  \* MERGEFORMAT </w:instrText>
-      </w:r>
-      <w:r>
-        <w:rPr>
-          <w:rFonts w:eastAsia="Times New Roman" w:cs="Times New Roman"/>
-          <w:color w:val="auto"/>
-          <w:sz w:val="22"/>
-          <w:szCs w:val="22"/>
-        </w:rPr>
-        <w:fldChar w:fldCharType="separate"/>
-      </w:r>
-      <w:r>
-        <w:rPr>
-          <w:rFonts w:eastAsia="Times New Roman" w:cs="Times New Roman"/>
-          <w:noProof/>
-          <w:color w:val="auto"/>
-          <w:sz w:val="22"/>
-          <w:szCs w:val="22"/>
-        </w:rPr>
-        <w:t>«DisplayTitle»</w:t>
-      </w:r>
-      <w:r>
-        <w:rPr>
-          <w:rFonts w:eastAsia="Times New Roman" w:cs="Times New Roman"/>
-          <w:color w:val="auto"/>
-          <w:sz w:val="22"/>
-          <w:szCs w:val="22"/>
-        </w:rPr>
-        <w:fldChar w:fldCharType="end"/>
-      </w:r>
-    </w:p>
+    <w:tbl>
+      <w:tblPr>
+        <w:tblStyle w:val="TableGrid"/>
+        <w:tblW w:w="0" w:type="auto"/>
+        <w:tblBorders>
+          <w:top w:val="none" w:sz="0" w:space="0" w:color="auto"/>
+          <w:left w:val="none" w:sz="0" w:space="0" w:color="auto"/>
+          <w:bottom w:val="none" w:sz="0" w:space="0" w:color="auto"/>
+          <w:right w:val="none" w:sz="0" w:space="0" w:color="auto"/>
+          <w:insideH w:val="none" w:sz="0" w:space="0" w:color="auto"/>
+          <w:insideV w:val="none" w:sz="0" w:space="0" w:color="auto"/>
+        </w:tblBorders>
+        <w:tblLook w:val="04A0" w:firstRow="1" w:lastRow="0" w:firstColumn="1" w:lastColumn="0" w:noHBand="0" w:noVBand="1"/>
+      </w:tblPr>
+      <w:tblGrid>
+        <w:gridCol w:w="5395"/>
+        <w:gridCol w:w="5395"/>
+      </w:tblGrid>
+      <w:tr>
+        <w:tc>
+          <w:tcPr>
+            <w:tcW w:w="5395" w:type="dxa"/>
+            <w:shd w:val="clear" w:color="auto" w:fill="auto"/>
+          </w:tcPr>
+          <w:p>
+            <w:pPr>
+              <w:tabs>
+                <w:tab w:val="right" w:pos="12780"/>
+              </w:tabs>
+              <w:spacing w:before="0" w:after="200" w:line="276" w:lineRule="auto"/>
+              <w:ind w:left="0" w:right="0"/>
+              <w:contextualSpacing/>
+              <w:rPr>
+                <w:rFonts w:eastAsia="Times New Roman" w:cs="Times New Roman"/>
+                <w:color w:val="auto"/>
+                <w:sz w:val="28"/>
+                <w:szCs w:val="28"/>
+              </w:rPr>
+            </w:pPr>
+            <w:r>
+              <w:rPr>
+                <w:rFonts w:eastAsia="Times New Roman" w:cs="Times New Roman"/>
+                <w:color w:val="auto"/>
+                <w:sz w:val="28"/>
+                <w:szCs w:val="28"/>
+              </w:rPr>
+              <w:t xml:space="preserve">From: </w:t>
+            </w:r>
+            <w:r>
+              <w:rPr>
+                <w:rFonts w:eastAsia="Times New Roman" w:cs="Times New Roman"/>
+                <w:b/>
+                <w:color w:val="auto"/>
+                <w:sz w:val="28"/>
+                <w:szCs w:val="28"/>
+              </w:rPr>
+              <w:t>Total Training Solutions</w:t>
+            </w:r>
+            <w:r>
+              <w:rPr>
+                <w:rFonts w:eastAsia="Times New Roman" w:cs="Times New Roman"/>
+                <w:color w:val="auto"/>
+                <w:sz w:val="28"/>
+                <w:szCs w:val="28"/>
+              </w:rPr>
+              <w:t xml:space="preserve"> </w:t>
+            </w:r>
+          </w:p>
+          <w:p>
+            <w:pPr>
+              <w:tabs>
+                <w:tab w:val="right" w:pos="12780"/>
+              </w:tabs>
+              <w:spacing w:before="0" w:after="200" w:line="276" w:lineRule="auto"/>
+              <w:ind w:left="0" w:right="0"/>
+              <w:contextualSpacing/>
+              <w:rPr>
+                <w:rFonts w:eastAsia="Times New Roman" w:cs="Times New Roman"/>
+                <w:color w:val="auto"/>
+                <w:sz w:val="28"/>
+                <w:szCs w:val="28"/>
+              </w:rPr>
+            </w:pPr>
+            <w:r>
+              <w:rPr>
+                <w:rFonts w:eastAsia="Times New Roman" w:cs="Times New Roman"/>
+                <w:color w:val="auto"/>
+                <w:sz w:val="28"/>
+                <w:szCs w:val="28"/>
+              </w:rPr>
+              <w:t xml:space="preserve">Invoice Number: </w:t>
+            </w:r>
+            <w:r>
+              <w:rPr>
+                <w:rFonts w:eastAsia="Times New Roman" w:cs="Times New Roman"/>
+                <w:b/>
+                <w:color w:val="auto"/>
+                <w:sz w:val="28"/>
+                <w:szCs w:val="28"/>
+              </w:rPr>
+              <w:fldChar w:fldCharType="begin"/>
+            </w:r>
+            <w:r>
+              <w:rPr>
+                <w:rFonts w:eastAsia="Times New Roman" w:cs="Times New Roman"/>
+                <w:b/>
+                <w:color w:val="auto"/>
+                <w:sz w:val="28"/>
+                <w:szCs w:val="28"/>
+              </w:rPr>
+              <w:instrText xml:space="preserve"> MERGEFIELD  InvoiceID  \* MERGEFORMAT </w:instrText>
+            </w:r>
+            <w:r>
+              <w:rPr>
+                <w:rFonts w:eastAsia="Times New Roman" w:cs="Times New Roman"/>
+                <w:b/>
+                <w:color w:val="auto"/>
+                <w:sz w:val="28"/>
+                <w:szCs w:val="28"/>
+              </w:rPr>
+              <w:fldChar w:fldCharType="separate"/>
+            </w:r>
+            <w:r>
+              <w:rPr>
+                <w:rFonts w:eastAsia="Times New Roman" w:cs="Times New Roman"/>
+                <w:b/>
+                <w:noProof/>
+                <w:color w:val="auto"/>
+                <w:sz w:val="28"/>
+                <w:szCs w:val="28"/>
+              </w:rPr>
+              <w:t>«InvoiceID»</w:t>
+            </w:r>
+            <w:r>
+              <w:rPr>
+                <w:rFonts w:eastAsia="Times New Roman" w:cs="Times New Roman"/>
+                <w:b/>
+                <w:color w:val="auto"/>
+                <w:sz w:val="28"/>
+                <w:szCs w:val="28"/>
+              </w:rPr>
+              <w:fldChar w:fldCharType="end"/>
+            </w:r>
+            <w:r>
+              <w:rPr>
+                <w:rFonts w:eastAsia="Times New Roman" w:cs="Times New Roman"/>
+                <w:color w:val="auto"/>
+                <w:sz w:val="28"/>
+                <w:szCs w:val="28"/>
+              </w:rPr>
+              <w:t xml:space="preserve"> </w:t>
+            </w:r>
+          </w:p>
+          <w:p>
+            <w:pPr>
+              <w:tabs>
+                <w:tab w:val="right" w:pos="12780"/>
+              </w:tabs>
+              <w:spacing w:before="0" w:after="200" w:line="276" w:lineRule="auto"/>
+              <w:ind w:left="0" w:right="0"/>
+              <w:contextualSpacing/>
+              <w:rPr>
+                <w:rFonts w:eastAsia="Times New Roman" w:cs="Times New Roman"/>
+                <w:color w:val="auto"/>
+                <w:sz w:val="28"/>
+                <w:szCs w:val="28"/>
+              </w:rPr>
+            </w:pPr>
+          </w:p>
+        </w:tc>
+        <w:tc>
+          <w:tcPr>
+            <w:tcW w:w="5395" w:type="dxa"/>
+            <w:shd w:val="clear" w:color="auto" w:fill="auto"/>
+          </w:tcPr>
+          <w:p>
+            <w:pPr>
+              <w:tabs>
+                <w:tab w:val="right" w:pos="12780"/>
+              </w:tabs>
+              <w:spacing w:before="0" w:after="200" w:line="276" w:lineRule="auto"/>
+              <w:ind w:left="0" w:right="0"/>
+              <w:contextualSpacing/>
+              <w:jc w:val="right"/>
+              <w:rPr>
+                <w:rFonts w:eastAsia="Times New Roman" w:cs="Times New Roman"/>
+                <w:b/>
+                <w:color w:val="auto"/>
+                <w:sz w:val="28"/>
+                <w:szCs w:val="28"/>
+              </w:rPr>
+            </w:pPr>
+            <w:r>
+              <w:rPr>
+                <w:rFonts w:eastAsia="Times New Roman" w:cs="Times New Roman"/>
+                <w:color w:val="auto"/>
+                <w:sz w:val="28"/>
+                <w:szCs w:val="28"/>
+              </w:rPr>
+              <w:t xml:space="preserve">To: </w:t>
+            </w:r>
+            <w:r>
+              <w:rPr>
+                <w:rFonts w:eastAsia="Times New Roman" w:cs="Times New Roman"/>
+                <w:b/>
+                <w:color w:val="auto"/>
+                <w:sz w:val="28"/>
+                <w:szCs w:val="28"/>
+              </w:rPr>
+              <w:fldChar w:fldCharType="begin"/>
+            </w:r>
+            <w:r>
+              <w:rPr>
+                <w:rFonts w:eastAsia="Times New Roman" w:cs="Times New Roman"/>
+                <w:b/>
+                <w:color w:val="auto"/>
+                <w:sz w:val="28"/>
+                <w:szCs w:val="28"/>
+              </w:rPr>
+              <w:instrText xml:space="preserve"> MERGEFIELD  DisplayTitle  \* MERGEFORMAT </w:instrText>
+            </w:r>
+            <w:r>
+              <w:rPr>
+                <w:rFonts w:eastAsia="Times New Roman" w:cs="Times New Roman"/>
+                <w:b/>
+                <w:color w:val="auto"/>
+                <w:sz w:val="28"/>
+                <w:szCs w:val="28"/>
+              </w:rPr>
+              <w:fldChar w:fldCharType="separate"/>
+            </w:r>
+            <w:r>
+              <w:rPr>
+                <w:rFonts w:eastAsia="Times New Roman" w:cs="Times New Roman"/>
+                <w:b/>
+                <w:noProof/>
+                <w:color w:val="auto"/>
+                <w:sz w:val="28"/>
+                <w:szCs w:val="28"/>
+              </w:rPr>
+              <w:t>«DisplayTitle»</w:t>
+            </w:r>
+            <w:r>
+              <w:rPr>
+                <w:rFonts w:eastAsia="Times New Roman" w:cs="Times New Roman"/>
+                <w:b/>
+                <w:color w:val="auto"/>
+                <w:sz w:val="28"/>
+                <w:szCs w:val="28"/>
+              </w:rPr>
+              <w:fldChar w:fldCharType="end"/>
+            </w:r>
+          </w:p>
+          <w:p>
+            <w:pPr>
+              <w:tabs>
+                <w:tab w:val="right" w:pos="12780"/>
+              </w:tabs>
+              <w:spacing w:before="0" w:after="200" w:line="276" w:lineRule="auto"/>
+              <w:ind w:left="0" w:right="0"/>
+              <w:contextualSpacing/>
+              <w:jc w:val="right"/>
+              <w:rPr>
+                <w:rFonts w:eastAsia="Times New Roman" w:cs="Times New Roman"/>
+                <w:b/>
+                <w:color w:val="auto"/>
+                <w:sz w:val="28"/>
+                <w:szCs w:val="28"/>
+              </w:rPr>
+            </w:pPr>
+            <w:r>
+              <w:rPr>
+                <w:rFonts w:eastAsia="Times New Roman" w:cs="Times New Roman"/>
+                <w:color w:val="auto"/>
+                <w:sz w:val="28"/>
+                <w:szCs w:val="28"/>
+              </w:rPr>
+              <w:t xml:space="preserve">Date Range: </w:t>
+            </w:r>
+            <w:r>
+              <w:rPr>
+                <w:rFonts w:eastAsia="Times New Roman" w:cs="Times New Roman"/>
+                <w:b/>
+                <w:color w:val="auto"/>
+                <w:sz w:val="28"/>
+                <w:szCs w:val="28"/>
+              </w:rPr>
+              <w:fldChar w:fldCharType="begin"/>
+            </w:r>
+            <w:r>
+              <w:rPr>
+                <w:rFonts w:eastAsia="Times New Roman" w:cs="Times New Roman"/>
+                <w:b/>
+                <w:color w:val="auto"/>
+                <w:sz w:val="28"/>
+                <w:szCs w:val="28"/>
+              </w:rPr>
+              <w:instrText xml:space="preserve"> MERGEFIELD  DateRange  \* MERGEFORMAT </w:instrText>
+            </w:r>
+            <w:r>
+              <w:rPr>
+                <w:rFonts w:eastAsia="Times New Roman" w:cs="Times New Roman"/>
+                <w:b/>
+                <w:color w:val="auto"/>
+                <w:sz w:val="28"/>
+                <w:szCs w:val="28"/>
+              </w:rPr>
+              <w:fldChar w:fldCharType="separate"/>
+            </w:r>
+            <w:r>
+              <w:rPr>
+                <w:rFonts w:eastAsia="Times New Roman" w:cs="Times New Roman"/>
+                <w:b/>
+                <w:noProof/>
+                <w:color w:val="auto"/>
+                <w:sz w:val="28"/>
+                <w:szCs w:val="28"/>
+              </w:rPr>
+              <w:t>«DateRange»</w:t>
+            </w:r>
+            <w:r>
+              <w:rPr>
+                <w:rFonts w:eastAsia="Times New Roman" w:cs="Times New Roman"/>
+                <w:b/>
+                <w:color w:val="auto"/>
+                <w:sz w:val="28"/>
+                <w:szCs w:val="28"/>
+              </w:rPr>
+              <w:fldChar w:fldCharType="end"/>
+            </w:r>
+          </w:p>
+          <w:p>
+            <w:pPr>
+              <w:tabs>
+                <w:tab w:val="right" w:pos="12780"/>
+              </w:tabs>
+              <w:spacing w:before="0" w:after="200" w:line="276" w:lineRule="auto"/>
+              <w:ind w:left="0" w:right="0"/>
+              <w:contextualSpacing/>
+              <w:jc w:val="right"/>
+              <w:rPr>
+                <w:rFonts w:eastAsia="Times New Roman" w:cs="Times New Roman"/>
+                <w:color w:val="auto"/>
+                <w:sz w:val="28"/>
+                <w:szCs w:val="28"/>
+              </w:rPr>
+            </w:pPr>
+          </w:p>
+        </w:tc>
+      </w:tr>
+    </w:tbl>
     <w:p>
       <w:pPr>
         <w:spacing w:before="0" w:after="200" w:line="276" w:lineRule="auto"/>
@@ -1850,8 +1981,6 @@
         </w:rPr>
         <w:t xml:space="preserve"> are</w:t>
       </w:r>
-      <w:bookmarkStart w:id="0" w:name="_GoBack"/>
-      <w:bookmarkEnd w:id="0"/>
       <w:r>
         <w:rPr>
           <w:rFonts w:eastAsia="Times New Roman" w:cs="Times New Roman"/>
@@ -3492,42 +3621,42 @@
             <w:pPr>
               <w:jc w:val="right"/>
             </w:pPr>
-            <w:r>
-              <w:fldChar w:fldCharType="begin"/>
-            </w:r>
-            <w:r>
-              <w:instrText xml:space="preserve"> MERGEFIELD  RangeStart:uOrders  \* MERGEFORMAT </w:instrText>
-            </w:r>
-            <w:r>
-              <w:fldChar w:fldCharType="separate"/>
-            </w:r>
-            <w:r>
-              <w:rPr>
-                <w:noProof/>
-              </w:rPr>
-              <w:t>«Ran</w:t>
-            </w:r>
-            <w:r>
-              <w:rPr>
-                <w:noProof/>
-              </w:rPr>
-              <w:lastRenderedPageBreak/>
-              <w:t>geStart:uOrders»</w:t>
-            </w:r>
-            <w:r>
-              <w:rPr>
-                <w:noProof/>
-              </w:rPr>
-              <w:fldChar w:fldCharType="end"/>
-            </w:r>
-            <w:fldSimple w:instr=" MERGEFIELD  RowNumber \f .  \* MERGEFORMAT ">
+            <w:fldSimple w:instr=" MERGEFIELD  RangeStart:uOrders  \* MERGEFORMAT ">
               <w:r>
                 <w:rPr>
                   <w:noProof/>
                 </w:rPr>
-                <w:t>«RowNumber».</w:t>
+                <w:t>«Ra</w:t>
+              </w:r>
+              <w:r>
+                <w:rPr>
+                  <w:noProof/>
+                </w:rPr>
+                <w:lastRenderedPageBreak/>
+                <w:t>ngeStart:uOrders»</w:t>
               </w:r>
             </w:fldSimple>
+            <w:r>
+              <w:fldChar w:fldCharType="begin"/>
+            </w:r>
+            <w:r>
+              <w:instrText xml:space="preserve"> MERGEFIELD  RowNumber \f .  \* MERGEFORMAT </w:instrText>
+            </w:r>
+            <w:r>
+              <w:fldChar w:fldCharType="separate"/>
+            </w:r>
+            <w:r>
+              <w:rPr>
+                <w:noProof/>
+              </w:rPr>
+              <w:t>«RowNumber».</w:t>
+            </w:r>
+            <w:r>
+              <w:rPr>
+                <w:noProof/>
+              </w:rPr>
+              <w:fldChar w:fldCharType="end"/>
+            </w:r>
           </w:p>
         </w:tc>
         <w:tc>
@@ -3763,6 +3892,7 @@
                 <w:sz w:val="22"/>
                 <w:szCs w:val="22"/>
               </w:rPr>
+              <w:lastRenderedPageBreak/>
               <w:fldChar w:fldCharType="begin"/>
             </w:r>
             <w:r>
@@ -3826,6 +3956,7 @@
                 <w:color w:val="auto"/>
                 <w:szCs w:val="22"/>
               </w:rPr>
+              <w:lastRenderedPageBreak/>
               <w:fldChar w:fldCharType="begin"/>
             </w:r>
             <w:r>
@@ -3874,36 +4005,23 @@
                 <w:sz w:val="22"/>
               </w:rPr>
             </w:pPr>
-            <w:r>
-              <w:fldChar w:fldCharType="begin"/>
-            </w:r>
-            <w:r>
-              <w:instrText xml:space="preserve"> MERGEFIELD  AdjustedRoyalty  \* MERGEFORMAT </w:instrText>
-            </w:r>
-            <w:r>
-              <w:fldChar w:fldCharType="separate"/>
-            </w:r>
-            <w:r>
-              <w:rPr>
-                <w:noProof/>
-              </w:rPr>
-              <w:t>«</w:t>
-            </w:r>
-            <w:r>
-              <w:t>AdjustedRoyalty</w:t>
-            </w:r>
-            <w:r>
-              <w:rPr>
-                <w:noProof/>
-              </w:rPr>
-              <w:t>»</w:t>
-            </w:r>
-            <w:r>
-              <w:rPr>
-                <w:noProof/>
-              </w:rPr>
-              <w:fldChar w:fldCharType="end"/>
-            </w:r>
+            <w:fldSimple w:instr=" MERGEFIELD  AdjustedRoyalty  \* MERGEFORMAT ">
+              <w:r>
+                <w:rPr>
+                  <w:noProof/>
+                </w:rPr>
+                <w:t>«</w:t>
+              </w:r>
+              <w:r>
+                <w:t>AdjustedRoyalty</w:t>
+              </w:r>
+              <w:r>
+                <w:rPr>
+                  <w:noProof/>
+                </w:rPr>
+                <w:t>»</w:t>
+              </w:r>
+            </w:fldSimple>
           </w:p>
         </w:tc>
         <w:tc>
@@ -3961,14 +4079,27 @@
               </w:rPr>
               <w:t xml:space="preserve"> </w:t>
             </w:r>
-            <w:fldSimple w:instr=" MERGEFIELD  RangeEnd:uOrders  \* MERGEFORMAT ">
-              <w:r>
-                <w:rPr>
-                  <w:noProof/>
-                </w:rPr>
-                <w:t>«RangeEnd:uOrders»</w:t>
-              </w:r>
-            </w:fldSimple>
+            <w:r>
+              <w:fldChar w:fldCharType="begin"/>
+            </w:r>
+            <w:r>
+              <w:instrText xml:space="preserve"> MERGEFIELD  RangeEnd:uOrders  \* MERGEFORMAT </w:instrText>
+            </w:r>
+            <w:r>
+              <w:fldChar w:fldCharType="separate"/>
+            </w:r>
+            <w:r>
+              <w:rPr>
+                <w:noProof/>
+              </w:rPr>
+              <w:t>«RangeEnd:uOrders»</w:t>
+            </w:r>
+            <w:r>
+              <w:rPr>
+                <w:noProof/>
+              </w:rPr>
+              <w:fldChar w:fldCharType="end"/>
+            </w:r>
           </w:p>
         </w:tc>
       </w:tr>
@@ -4962,6 +5093,7 @@
     <w:lsdException w:name="HTML Sample" w:semiHidden="1" w:unhideWhenUsed="1"/>
     <w:lsdException w:name="HTML Typewriter" w:semiHidden="1" w:unhideWhenUsed="1"/>
     <w:lsdException w:name="HTML Variable" w:semiHidden="1" w:unhideWhenUsed="1"/>
+    <w:lsdException w:name="Normal Table" w:semiHidden="1" w:unhideWhenUsed="1"/>
     <w:lsdException w:name="annotation subject" w:semiHidden="1" w:unhideWhenUsed="1"/>
     <w:lsdException w:name="No List" w:semiHidden="1" w:unhideWhenUsed="1"/>
     <w:lsdException w:name="Outline List 1" w:semiHidden="1" w:unhideWhenUsed="1"/>
@@ -5008,8 +5140,10 @@
     <w:lsdException w:name="Table Subtle 2" w:semiHidden="1" w:unhideWhenUsed="1"/>
     <w:lsdException w:name="Table Web 1" w:semiHidden="1" w:unhideWhenUsed="1"/>
     <w:lsdException w:name="Table Web 2" w:semiHidden="1" w:unhideWhenUsed="1"/>
+    <w:lsdException w:name="Table Web 3" w:semiHidden="1" w:unhideWhenUsed="1"/>
     <w:lsdException w:name="Balloon Text" w:semiHidden="1" w:unhideWhenUsed="1"/>
     <w:lsdException w:name="Table Grid" w:uiPriority="39"/>
+    <w:lsdException w:name="Table Theme" w:semiHidden="1" w:unhideWhenUsed="1"/>
     <w:lsdException w:name="Placeholder Text" w:semiHidden="1"/>
     <w:lsdException w:name="No Spacing" w:uiPriority="1" w:qFormat="1"/>
     <w:lsdException w:name="Light Shading" w:uiPriority="60"/>

</xml_diff>